<commit_message>
Update data processing module
</commit_message>
<xml_diff>
--- a/docs/PonniRAG — Data Preprocessing Module.docx
+++ b/docs/PonniRAG — Data Preprocessing Module.docx
@@ -3902,6 +3902,450 @@
         <w:rPr>
           <w:rtl w:val="0"/>
         </w:rPr>
+      </w:r>
+    </w:p>
+    <w:p/>
+    <w:p>
+      <w:pPr>
+        <w:pStyle w:val="Heading2"/>
+      </w:pPr>
+      <w:r>
+        <w:t>10. Multi-Author CSV Field Parsing</w:t>
+      </w:r>
+    </w:p>
+    <w:p>
+      <w:r>
+        <w:t>The CSV metadata file (summary.csv) stores author names in a bracket-wrapped format to support multiple authors per article:</w:t>
+      </w:r>
+    </w:p>
+    <w:p>
+      <w:r>
+        <w:t>Single author: [நக்கீரன்]</w:t>
+        <w:br/>
+        <w:t>Multiple authors: [பாண்டியன், நா. வேத்தரசன், வணங்காமுடி]</w:t>
+        <w:br/>
+        <w:t>No author: [] or NA</w:t>
+      </w:r>
+    </w:p>
+    <w:p>
+      <w:r>
+        <w:t>The csv_fuzzy_matcher.load_csv() function uses quotechar='"' to preserve multi-author bracket fields as single CSV cells. The parse_author_field() function handles parsing:</w:t>
+      </w:r>
+    </w:p>
+    <w:p>
+      <w:r>
+        <w:t>1. Strip outer brackets []</w:t>
+        <w:br/>
+        <w:t>2. Split by comma for multiple authors</w:t>
+        <w:br/>
+        <w:t>3. Trim whitespace from each name</w:t>
+        <w:br/>
+        <w:t>4. Filter NA/nan/None sentinels</w:t>
+        <w:br/>
+        <w:t>5. Return list of author name strings</w:t>
+      </w:r>
+    </w:p>
+    <w:p>
+      <w:r>
+        <w:t>For display, _format_author_display() in csv_queries.py joins authors with comma-space (no brackets) and returns 'NA' for empty author lists.</w:t>
+      </w:r>
+    </w:p>
+    <w:p/>
+    <w:p>
+      <w:pPr>
+        <w:pStyle w:val="Heading2"/>
+      </w:pPr>
+      <w:r>
+        <w:t>11. Two-Pass Fuzzy Title Matching</w:t>
+      </w:r>
+    </w:p>
+    <w:p>
+      <w:r>
+        <w:t>Article boundary detection in csv_fuzzy_matcher.find_article_boundary_fuzzy() uses a two-pass strategy to handle the TOC occurrence vs. standalone occurrence problem:</w:t>
+      </w:r>
+    </w:p>
+    <w:p>
+      <w:r>
+        <w:t>Pass 1 — Collect all candidate lines with ≥70% title similarity across the full document.</w:t>
+      </w:r>
+    </w:p>
+    <w:p>
+      <w:r>
+        <w:t>Pass 2 — Selection logic:</w:t>
+        <w:br/>
+        <w:t>• Prefer near-exact match (≥95% similarity) — this picks the standalone title line rather than the TOC line which contains title + author + page.</w:t>
+        <w:br/>
+        <w:t>• Fallback: best fuzzy match if no near-exact found.</w:t>
+      </w:r>
+    </w:p>
+    <w:p>
+      <w:pPr>
+        <w:pStyle w:val="Heading3"/>
+      </w:pPr>
+      <w:r>
+        <w:t>Fuzzy Matching Thresholds</w:t>
+      </w:r>
+    </w:p>
+    <w:p>
+      <w:r>
+        <w:t>• Candidate similarity: ≥70%</w:t>
+        <w:br/>
+        <w:t>• Near-exact match: ≥95%</w:t>
+        <w:br/>
+        <w:t>• Next title boundary: ≥80%</w:t>
+        <w:br/>
+        <w:t>• Fuzzy issue matching: ≥80%</w:t>
+        <w:br/>
+        <w:t>• Author fuzzy matching: ≥80%</w:t>
+      </w:r>
+    </w:p>
+    <w:p>
+      <w:r>
+        <w:t>Why: TOC lines contain 'title + author + page' → lower similarity score. Standalone title lines are just the title → ≥95% match. This prevents the system from anchoring extraction at the TOC instead of the actual article start.</w:t>
+      </w:r>
+    </w:p>
+    <w:p/>
+    <w:p>
+      <w:pPr>
+        <w:pStyle w:val="Heading2"/>
+      </w:pPr>
+      <w:r>
+        <w:t>12. Three-Phase Extraction Model</w:t>
+      </w:r>
+    </w:p>
+    <w:p>
+      <w:r>
+        <w:t>The extraction pipeline in parse_tamil_document() now operates in three distinct phases with line-level tracking via a processed_lines boolean array:</w:t>
+      </w:r>
+    </w:p>
+    <w:p>
+      <w:pPr>
+        <w:pStyle w:val="Heading3"/>
+      </w:pPr>
+      <w:r>
+        <w:t>Phase 1: TOC Preparation</w:t>
+      </w:r>
+    </w:p>
+    <w:p>
+      <w:r>
+        <w:t>• Detect TOC boundaries (பொருளடக்கம் to ஆகியோரின் markers)</w:t>
+        <w:br/>
+        <w:t>• Extract author names from TOC for pattern matching</w:t>
+        <w:br/>
+        <w:t>• Mark TOC lines (0 to toc_end) as processed</w:t>
+      </w:r>
+    </w:p>
+    <w:p>
+      <w:pPr>
+        <w:pStyle w:val="Heading3"/>
+      </w:pPr>
+      <w:r>
+        <w:t>Phase 2: CSV-Based Extraction (Primary)</w:t>
+      </w:r>
+    </w:p>
+    <w:p>
+      <w:r>
+        <w:t>• Independent of TOC — searches the full document</w:t>
+        <w:br/>
+        <w:t>• Uses fuzzy title matching from summary.csv catalogue</w:t>
+        <w:br/>
+        <w:t>• Marks extracted lines as processed</w:t>
+        <w:br/>
+        <w:t>• Merges discovered author names into the pattern authors list</w:t>
+        <w:br/>
+        <w:t>• Article numbering starts at 1</w:t>
+      </w:r>
+    </w:p>
+    <w:p>
+      <w:pPr>
+        <w:pStyle w:val="Heading3"/>
+      </w:pPr>
+      <w:r>
+        <w:t>Phase 3: Pattern-Based Extraction (Fallback)</w:t>
+      </w:r>
+    </w:p>
+    <w:p>
+      <w:r>
+        <w:t>• Runs only on remaining unprocessed lines</w:t>
+        <w:br/>
+        <w:t>• Uses combined author list (TOC authors + CSV-discovered authors)</w:t>
+        <w:br/>
+        <w:t>• Applies Patterns A, B, C in priority order</w:t>
+        <w:br/>
+        <w:t>• Article numbering continues from where CSV left off (e.g., if CSV produced articles 1–3, patterns start at 4)</w:t>
+      </w:r>
+    </w:p>
+    <w:p>
+      <w:r>
+        <w:t>This ensures no content is extracted twice and article numbering is continuous across both methods.</w:t>
+      </w:r>
+    </w:p>
+    <w:p/>
+    <w:p>
+      <w:pPr>
+        <w:pStyle w:val="Heading2"/>
+      </w:pPr>
+      <w:r>
+        <w:t>13. Four-Step Author Extraction Fallback</w:t>
+      </w:r>
+    </w:p>
+    <w:p>
+      <w:r>
+        <w:t>Author names are now extracted using four methods in priority order:</w:t>
+      </w:r>
+    </w:p>
+    <w:p>
+      <w:r>
+        <w:t>1. TOC Section Extraction (extract_authors_from_toc_section) — Parse the section between பொருளடக்கம் and ஆகியோரின் markers.</w:t>
+      </w:r>
+    </w:p>
+    <w:p>
+      <w:r>
+        <w:t>2. Content-Based Extraction (extract_authors_from_content) — Dash pattern (—, -, –) detection + position pattern (short-line-after-short-line). Used as fallback when no TOC exists.</w:t>
+      </w:r>
+    </w:p>
+    <w:p>
+      <w:r>
+        <w:t>3. TOC Line Parsing (extract_authors_from_toc via doc_utils) — Parse individual TOC entries formatted as 'Title  Author  Page'.</w:t>
+      </w:r>
+    </w:p>
+    <w:p>
+      <w:r>
+        <w:t>4. Shared Author Dictionary (build_shared_authors_dict_s3) — Cumulative author list from previously processed documents stored in S3.</w:t>
+      </w:r>
+    </w:p>
+    <w:p/>
+    <w:p>
+      <w:pPr>
+        <w:pStyle w:val="Heading2"/>
+      </w:pPr>
+      <w:r>
+        <w:t>14. Local Author Detection (shared_author_local.py)</w:t>
+      </w:r>
+    </w:p>
+    <w:p>
+      <w:r>
+        <w:t>An alternative to S3-based shared author lookup that operates without external dependencies. Used by content_extraction.py for intro section extraction.</w:t>
+      </w:r>
+    </w:p>
+    <w:p>
+      <w:r>
+        <w:t>Function: check_author_ahead(lines, current_idx, authors_normalized, authors_original, lookback=3)</w:t>
+      </w:r>
+    </w:p>
+    <w:p>
+      <w:r>
+        <w:t>• Scans a lookahead window (default 3 lines) from the current position</w:t>
+        <w:br/>
+        <w:t>• Checks if any upcoming line matches a known author name</w:t>
+        <w:br/>
+        <w:t>• Returns (is_author_ahead, author_name, author_line_idx)</w:t>
+        <w:br/>
+        <w:t>• Enables content extraction to stop before the next author boundary</w:t>
+      </w:r>
+    </w:p>
+    <w:p>
+      <w:r>
+        <w:t>This decouples intro content extraction from S3 data, allowing the pipeline to run in environments without S3 access.</w:t>
+      </w:r>
+    </w:p>
+    <w:p/>
+    <w:p>
+      <w:pPr>
+        <w:pStyle w:val="Heading2"/>
+      </w:pPr>
+      <w:r>
+        <w:t>15. Robust TOC Line Parsing</w:t>
+      </w:r>
+    </w:p>
+    <w:p>
+      <w:r>
+        <w:t>The parse_toc_line_robust() function in doc_utils.py handles multiple TOC formats:</w:t>
+      </w:r>
+    </w:p>
+    <w:p>
+      <w:r>
+        <w:t>• 4+ space splits — Standard 'Title    Author    Page' format</w:t>
+        <w:br/>
+        <w:t>• 3+ space splits — Compact format</w:t>
+        <w:br/>
+        <w:t>• 2+ space splits — Minimal spacing</w:t>
+        <w:br/>
+        <w:t>• Single-space splits — Dense format</w:t>
+      </w:r>
+    </w:p>
+    <w:p>
+      <w:r>
+        <w:t>Special handling:</w:t>
+        <w:br/>
+        <w:t>• Detects Tamil initials (e.g., 'ரா. நீலமேகம்')</w:t>
+        <w:br/>
+        <w:t>• Filters ellipsis '…' as placeholder for missing authors</w:t>
+        <w:br/>
+        <w:t>• Validates page numbers are numeric</w:t>
+      </w:r>
+    </w:p>
+    <w:p/>
+    <w:p>
+      <w:pPr>
+        <w:pStyle w:val="Heading2"/>
+      </w:pPr>
+      <w:r>
+        <w:t>16. Content Extraction Thresholds</w:t>
+      </w:r>
+    </w:p>
+    <w:p>
+      <w:pPr>
+        <w:pStyle w:val="Heading3"/>
+      </w:pPr>
+      <w:r>
+        <w:t>Blank Line Thresholds</w:t>
+      </w:r>
+    </w:p>
+    <w:p>
+      <w:r>
+        <w:t>• 3+ consecutive blank lines — Section boundary (content_extraction.py)</w:t>
+        <w:br/>
+        <w:t>• 4+ consecutive blank lines — Stop condition for intro extraction</w:t>
+        <w:br/>
+        <w:t>• 4+ consecutive blank lines — Stop condition for pattern-based article content collection</w:t>
+      </w:r>
+    </w:p>
+    <w:p>
+      <w:pPr>
+        <w:pStyle w:val="Heading3"/>
+      </w:pPr>
+      <w:r>
+        <w:t>Content Length Minimums</w:t>
+      </w:r>
+    </w:p>
+    <w:p>
+      <w:r>
+        <w:t>• Article content: minimum 100 characters (csv_fuzzy_matcher.py)</w:t>
+        <w:br/>
+        <w:t>• Content lines: minimum 4 non-empty lines (content_extraction.py)</w:t>
+        <w:br/>
+        <w:t>• Content words: minimum 50 words (validation rule)</w:t>
+      </w:r>
+    </w:p>
+    <w:p>
+      <w:pPr>
+        <w:pStyle w:val="Heading3"/>
+      </w:pPr>
+      <w:r>
+        <w:t>Heading Validation</w:t>
+      </w:r>
+    </w:p>
+    <w:p>
+      <w:r>
+        <w:t>• Maximum 100 characters</w:t>
+        <w:br/>
+        <w:t>• Must not be a known author name</w:t>
+        <w:br/>
+        <w:t>• Must contain at least one Tamil character</w:t>
+      </w:r>
+    </w:p>
+    <w:p/>
+    <w:p>
+      <w:pPr>
+        <w:pStyle w:val="Heading2"/>
+      </w:pPr>
+      <w:r>
+        <w:t>17. Intro Section Keywords (Full List)</w:t>
+      </w:r>
+    </w:p>
+    <w:p>
+      <w:r>
+        <w:t>The following 17 keywords in text_processing.get_intro_keywords() identify editorial and recurring column sections. These are extracted as standalone entries:</w:t>
+      </w:r>
+    </w:p>
+    <w:p>
+      <w:r>
+        <w:t>1. எங்கள் எண்ணம்</w:t>
+        <w:br/>
+        <w:t>2. காலமும் கருத்தும்</w:t>
+        <w:br/>
+        <w:t>3. பாரதிதாசன் பரம்பரை</w:t>
+        <w:br/>
+        <w:t>4. செய்திப்பாட்டு (variants: செய்திபாட்டு, செய்திப் பாட்டு)</w:t>
+        <w:br/>
+        <w:t>5. பொது மேடை (variant: பொதுமேடை)</w:t>
+      </w:r>
+    </w:p>
+    <w:p>
+      <w:r>
+        <w:t>Plus additional recurring column titles specific to the Ponni magazine archive.</w:t>
+      </w:r>
+    </w:p>
+    <w:p/>
+    <w:p>
+      <w:pPr>
+        <w:pStyle w:val="Heading2"/>
+      </w:pPr>
+      <w:r>
+        <w:t>18. Author Index Output to S3</w:t>
+      </w:r>
+    </w:p>
+    <w:p>
+      <w:r>
+        <w:t>After article extraction, an author index is saved to S3 via save_authors_to_s3():</w:t>
+      </w:r>
+    </w:p>
+    <w:p>
+      <w:r>
+        <w:t>Output: authors.json in the S3 output folder</w:t>
+      </w:r>
+    </w:p>
+    <w:p>
+      <w:r>
+        <w:t>Structure: [{"doc_id": "1", "doc_issue": "1", "authors": ["author1", "author2"]}, ...]</w:t>
+      </w:r>
+    </w:p>
+    <w:p>
+      <w:r>
+        <w:t>• Maintains author list per document (doc_id + doc_issue)</w:t>
+        <w:br/>
+        <w:t>• Supports incremental updates (adds new doc, updates existing)</w:t>
+        <w:br/>
+        <w:t>• Used by shared_author.py to build cumulative author dictionaries</w:t>
+        <w:br/>
+        <w:t>• Enables cross-document author consistency checking</w:t>
+      </w:r>
+    </w:p>
+    <w:p/>
+    <w:p>
+      <w:pPr>
+        <w:pStyle w:val="Heading2"/>
+      </w:pPr>
+      <w:r>
+        <w:t>19. Error Handling Strategy</w:t>
+      </w:r>
+    </w:p>
+    <w:p>
+      <w:r>
+        <w:t>All major pipeline functions implement structured error handling:</w:t>
+      </w:r>
+    </w:p>
+    <w:p>
+      <w:r>
+        <w:t>• INFO — Successful extractions, processing milestones</w:t>
+        <w:br/>
+        <w:t>• WARNING — Incomplete matches, fallback triggered, skipped content</w:t>
+        <w:br/>
+        <w:t>• ERROR with exc_info=True — Exceptions with full stack traces</w:t>
+      </w:r>
+    </w:p>
+    <w:p>
+      <w:r>
+        <w:t>Key error boundaries:</w:t>
+        <w:br/>
+        <w:t>• S3 key year extraction: catches ValueError from malformed S3 paths</w:t>
+        <w:br/>
+        <w:t>• JSON output validation: verifies structure before marking as processed</w:t>
+        <w:br/>
+        <w:t>• CSV loading: three fallback strategies (load_csv → pd.read_csv with quotechar → pd.read_csv with on_bad_lines='skip')</w:t>
+        <w:br/>
+        <w:t>• Author field parsing: handles pandas NA values gracefully</w:t>
       </w:r>
     </w:p>
     <w:sectPr>

</xml_diff>